<commit_message>
Add reference to doc
</commit_message>
<xml_diff>
--- a/week2/doc/week2_柏昇.docx
+++ b/week2/doc/week2_柏昇.docx
@@ -215,13 +215,7 @@
               <w:rPr>
                 <w:rFonts w:ascii="Times New Roman" w:eastAsia="標楷體" w:hAnsi="Times New Roman" w:cs="Times New Roman"/>
               </w:rPr>
-              <w:t xml:space="preserve">　　</w:t>
-            </w:r>
-            <w:r>
-              <w:rPr>
-                <w:rFonts w:ascii="Times New Roman" w:eastAsia="標楷體" w:hAnsi="Times New Roman" w:cs="Times New Roman"/>
-              </w:rPr>
-              <w:t>平滑降噪，原理主要是計算該點周圍的平均值，來達到降低雜訊，但也會使圖片模糊化。</w:t>
+              <w:t xml:space="preserve">　　平滑降噪，原理主要是計算該點周圍的平均值，來達到降低雜訊，但也會使圖片模糊化。</w:t>
             </w:r>
           </w:p>
         </w:tc>
@@ -245,6 +239,7 @@
             <w:r>
               <w:rPr>
                 <w:rFonts w:ascii="Times New Roman" w:eastAsia="標楷體" w:hAnsi="Times New Roman" w:cs="Times New Roman"/>
+                <w:noProof/>
               </w:rPr>
               <w:drawing>
                 <wp:inline distT="0" distB="0" distL="0" distR="0" wp14:anchorId="1DE36272" wp14:editId="37447446">
@@ -372,6 +367,7 @@
             <w:r>
               <w:rPr>
                 <w:rFonts w:ascii="Times New Roman" w:eastAsia="標楷體" w:hAnsi="Times New Roman" w:cs="Times New Roman"/>
+                <w:noProof/>
               </w:rPr>
               <w:drawing>
                 <wp:inline distT="0" distB="0" distL="0" distR="0" wp14:anchorId="495A6713" wp14:editId="24EC0624">
@@ -477,13 +473,7 @@
               <w:rPr>
                 <w:rFonts w:ascii="Times New Roman" w:eastAsia="標楷體" w:hAnsi="Times New Roman" w:cs="Times New Roman"/>
               </w:rPr>
-              <w:t xml:space="preserve">　　</w:t>
-            </w:r>
-            <w:r>
-              <w:rPr>
-                <w:rFonts w:ascii="Times New Roman" w:eastAsia="標楷體" w:hAnsi="Times New Roman" w:cs="Times New Roman"/>
-              </w:rPr>
-              <w:t>減少圖像雜訊以及降低細節層次，其視覺效果就像是經過一個半透明屏幕在觀察圖像。少了很多顆粒感，但也變模糊了。</w:t>
+              <w:t xml:space="preserve">　　減少圖像雜訊以及降低細節層次，其視覺效果就像是經過一個半透明屏幕在觀察圖像。少了很多顆粒感，但也變模糊了。</w:t>
             </w:r>
           </w:p>
         </w:tc>
@@ -508,6 +498,7 @@
             <w:r>
               <w:rPr>
                 <w:rFonts w:ascii="Times New Roman" w:eastAsia="標楷體" w:hAnsi="Times New Roman" w:cs="Times New Roman"/>
+                <w:noProof/>
               </w:rPr>
               <w:drawing>
                 <wp:inline distT="0" distB="0" distL="0" distR="0" wp14:anchorId="2CD52231" wp14:editId="0E555E41">
@@ -13474,13 +13465,7 @@
                       <w:rPr>
                         <w:rFonts w:ascii="Cambria Math" w:eastAsia="標楷體" w:hAnsi="Cambria Math" w:cs="Times New Roman"/>
                       </w:rPr>
-                      <m:t>x</m:t>
-                    </m:r>
-                    <m:r>
-                      <w:rPr>
-                        <w:rFonts w:ascii="Cambria Math" w:eastAsia="標楷體" w:hAnsi="Cambria Math" w:cs="Times New Roman"/>
-                      </w:rPr>
-                      <m:t>-1</m:t>
+                      <m:t>x-1</m:t>
                     </m:r>
                   </m:e>
                 </m:d>
@@ -13605,13 +13590,7 @@
                           <w:rPr>
                             <w:rFonts w:ascii="Cambria Math" w:eastAsia="標楷體" w:hAnsi="Cambria Math" w:cs="Times New Roman"/>
                           </w:rPr>
-                          <m:t>x</m:t>
-                        </m:r>
-                        <m:r>
-                          <w:rPr>
-                            <w:rFonts w:ascii="Cambria Math" w:eastAsia="標楷體" w:hAnsi="Cambria Math" w:cs="Times New Roman"/>
-                          </w:rPr>
-                          <m:t>+1</m:t>
+                          <m:t>x+1</m:t>
                         </m:r>
                       </m:e>
                     </m:d>
@@ -13645,13 +13624,7 @@
                   <w:rPr>
                     <w:rFonts w:ascii="Cambria Math" w:eastAsia="標楷體" w:hAnsi="Cambria Math" w:cs="Times New Roman"/>
                   </w:rPr>
-                  <m:t>-</m:t>
-                </m:r>
-                <m:r>
-                  <w:rPr>
-                    <w:rFonts w:ascii="Cambria Math" w:eastAsia="標楷體" w:hAnsi="Cambria Math" w:cs="Times New Roman"/>
-                  </w:rPr>
-                  <m:t>(f(x)-f</m:t>
+                  <m:t>-(f(x)-f</m:t>
                 </m:r>
                 <m:d>
                   <m:dPr>
@@ -13815,13 +13788,7 @@
                       <w:rPr>
                         <w:rFonts w:ascii="Cambria Math" w:eastAsia="標楷體" w:hAnsi="Cambria Math" w:cs="Times New Roman"/>
                       </w:rPr>
-                      <m:t>x</m:t>
-                    </m:r>
-                    <m:r>
-                      <w:rPr>
-                        <w:rFonts w:ascii="Cambria Math" w:eastAsia="標楷體" w:hAnsi="Cambria Math" w:cs="Times New Roman"/>
-                      </w:rPr>
-                      <m:t>,y</m:t>
+                      <m:t>x,y</m:t>
                     </m:r>
                   </m:e>
                 </m:d>
@@ -13829,13 +13796,7 @@
                   <w:rPr>
                     <w:rFonts w:ascii="Cambria Math" w:eastAsia="標楷體" w:hAnsi="Cambria Math" w:cs="Times New Roman"/>
                   </w:rPr>
-                  <m:t>=</m:t>
-                </m:r>
-                <m:r>
-                  <w:rPr>
-                    <w:rFonts w:ascii="Cambria Math" w:eastAsia="標楷體" w:hAnsi="Cambria Math" w:cs="Times New Roman"/>
-                  </w:rPr>
-                  <m:t>-4</m:t>
+                  <m:t>=-4</m:t>
                 </m:r>
                 <m:r>
                   <m:rPr>
@@ -13860,13 +13821,7 @@
                       <w:rPr>
                         <w:rFonts w:ascii="Cambria Math" w:eastAsia="標楷體" w:hAnsi="Cambria Math" w:cs="Times New Roman"/>
                       </w:rPr>
-                      <m:t>x</m:t>
-                    </m:r>
-                    <m:r>
-                      <w:rPr>
-                        <w:rFonts w:ascii="Cambria Math" w:eastAsia="標楷體" w:hAnsi="Cambria Math" w:cs="Times New Roman"/>
-                      </w:rPr>
-                      <m:t>,y</m:t>
+                      <m:t>x,y</m:t>
                     </m:r>
                   </m:e>
                 </m:d>
@@ -13877,16 +13832,7 @@
                   <w:rPr>
                     <w:rFonts w:ascii="Cambria Math" w:eastAsia="標楷體" w:hAnsi="Cambria Math" w:cs="Times New Roman"/>
                   </w:rPr>
-                  <m:t>+</m:t>
-                </m:r>
-                <m:r>
-                  <m:rPr>
-                    <m:sty m:val="p"/>
-                  </m:rPr>
-                  <w:rPr>
-                    <w:rFonts w:ascii="Cambria Math" w:eastAsia="標楷體" w:hAnsi="Cambria Math" w:cs="Times New Roman"/>
-                  </w:rPr>
-                  <m:t>f</m:t>
+                  <m:t>+f</m:t>
                 </m:r>
                 <m:d>
                   <m:dPr>
@@ -13902,13 +13848,7 @@
                       <w:rPr>
                         <w:rFonts w:ascii="Cambria Math" w:eastAsia="標楷體" w:hAnsi="Cambria Math" w:cs="Times New Roman"/>
                       </w:rPr>
-                      <m:t>x-1</m:t>
-                    </m:r>
-                    <m:r>
-                      <w:rPr>
-                        <w:rFonts w:ascii="Cambria Math" w:eastAsia="標楷體" w:hAnsi="Cambria Math" w:cs="Times New Roman"/>
-                      </w:rPr>
-                      <m:t>,y</m:t>
+                      <m:t>x-1,y</m:t>
                     </m:r>
                   </m:e>
                 </m:d>
@@ -13941,19 +13881,7 @@
                       <w:rPr>
                         <w:rFonts w:ascii="Cambria Math" w:eastAsia="標楷體" w:hAnsi="Cambria Math" w:cs="Times New Roman"/>
                       </w:rPr>
-                      <m:t>x</m:t>
-                    </m:r>
-                    <m:r>
-                      <w:rPr>
-                        <w:rFonts w:ascii="Cambria Math" w:eastAsia="標楷體" w:hAnsi="Cambria Math" w:cs="Times New Roman"/>
-                      </w:rPr>
-                      <m:t>+</m:t>
-                    </m:r>
-                    <m:r>
-                      <w:rPr>
-                        <w:rFonts w:ascii="Cambria Math" w:eastAsia="標楷體" w:hAnsi="Cambria Math" w:cs="Times New Roman"/>
-                      </w:rPr>
-                      <m:t>1,y</m:t>
+                      <m:t>x+1,y</m:t>
                     </m:r>
                   </m:e>
                 </m:d>
@@ -13986,13 +13914,7 @@
                       <w:rPr>
                         <w:rFonts w:ascii="Cambria Math" w:eastAsia="標楷體" w:hAnsi="Cambria Math" w:cs="Times New Roman"/>
                       </w:rPr>
-                      <m:t>x,y</m:t>
-                    </m:r>
-                    <m:r>
-                      <w:rPr>
-                        <w:rFonts w:ascii="Cambria Math" w:eastAsia="標楷體" w:hAnsi="Cambria Math" w:cs="Times New Roman"/>
-                      </w:rPr>
-                      <m:t>-1</m:t>
+                      <m:t>x,y-1</m:t>
                     </m:r>
                   </m:e>
                 </m:d>
@@ -14025,19 +13947,7 @@
                       <w:rPr>
                         <w:rFonts w:ascii="Cambria Math" w:eastAsia="標楷體" w:hAnsi="Cambria Math" w:cs="Times New Roman"/>
                       </w:rPr>
-                      <m:t>x,y</m:t>
-                    </m:r>
-                    <m:r>
-                      <w:rPr>
-                        <w:rFonts w:ascii="Cambria Math" w:eastAsia="標楷體" w:hAnsi="Cambria Math" w:cs="Times New Roman"/>
-                      </w:rPr>
-                      <m:t>+</m:t>
-                    </m:r>
-                    <m:r>
-                      <w:rPr>
-                        <w:rFonts w:ascii="Cambria Math" w:eastAsia="標楷體" w:hAnsi="Cambria Math" w:cs="Times New Roman"/>
-                      </w:rPr>
-                      <m:t>1</m:t>
+                      <m:t>x,y+1</m:t>
                     </m:r>
                   </m:e>
                 </m:d>
@@ -14486,6 +14396,7 @@
                 <w:sz w:val="21"/>
                 <w:szCs w:val="21"/>
               </w:rPr>
+              <w:lastRenderedPageBreak/>
               <w:t>// Edge Detect: Sobel, Laplacian</w:t>
             </w:r>
           </w:p>
@@ -16248,7 +16159,6 @@
                 <w:sz w:val="21"/>
                 <w:szCs w:val="21"/>
               </w:rPr>
-              <w:lastRenderedPageBreak/>
               <w:t>            // G = (</w:t>
             </w:r>
             <w:proofErr w:type="spellStart"/>
@@ -16793,6 +16703,7 @@
                 <w:sz w:val="21"/>
                 <w:szCs w:val="21"/>
               </w:rPr>
+              <w:lastRenderedPageBreak/>
               <w:t xml:space="preserve">        </w:t>
             </w:r>
             <w:r>
@@ -19201,405 +19112,405 @@
                 <w:sz w:val="21"/>
                 <w:szCs w:val="21"/>
               </w:rPr>
+              <w:t>{</w:t>
+            </w:r>
+          </w:p>
+          <w:p>
+            <w:pPr>
+              <w:widowControl/>
+              <w:shd w:val="clear" w:color="auto" w:fill="1E1E1E"/>
+              <w:spacing w:line="285" w:lineRule="atLeast"/>
+              <w:rPr>
+                <w:rFonts w:ascii="Consolas" w:eastAsia="新細明體" w:hAnsi="Consolas" w:cs="新細明體"/>
+                <w:color w:val="D4D4D4"/>
+                <w:kern w:val="0"/>
+                <w:sz w:val="21"/>
+                <w:szCs w:val="21"/>
+              </w:rPr>
+            </w:pPr>
+            <w:r>
+              <w:rPr>
+                <w:rFonts w:ascii="Consolas" w:eastAsia="新細明體" w:hAnsi="Consolas" w:cs="新細明體"/>
+                <w:color w:val="6A9955"/>
+                <w:kern w:val="0"/>
+                <w:sz w:val="21"/>
+                <w:szCs w:val="21"/>
+              </w:rPr>
+              <w:t xml:space="preserve">    // </w:t>
+            </w:r>
+            <w:proofErr w:type="spellStart"/>
+            <w:r>
+              <w:rPr>
+                <w:rFonts w:ascii="Consolas" w:eastAsia="新細明體" w:hAnsi="Consolas" w:cs="新細明體"/>
+                <w:color w:val="6A9955"/>
+                <w:kern w:val="0"/>
+                <w:sz w:val="21"/>
+                <w:szCs w:val="21"/>
+              </w:rPr>
+              <w:t>Initialise</w:t>
+            </w:r>
+            <w:proofErr w:type="spellEnd"/>
+            <w:r>
+              <w:rPr>
+                <w:rFonts w:ascii="Consolas" w:eastAsia="新細明體" w:hAnsi="Consolas" w:cs="新細明體"/>
+                <w:color w:val="6A9955"/>
+                <w:kern w:val="0"/>
+                <w:sz w:val="21"/>
+                <w:szCs w:val="21"/>
+              </w:rPr>
+              <w:t xml:space="preserve"> values</w:t>
+            </w:r>
+          </w:p>
+          <w:p>
+            <w:pPr>
+              <w:widowControl/>
+              <w:shd w:val="clear" w:color="auto" w:fill="1E1E1E"/>
+              <w:spacing w:line="285" w:lineRule="atLeast"/>
+              <w:rPr>
+                <w:rFonts w:ascii="Consolas" w:eastAsia="新細明體" w:hAnsi="Consolas" w:cs="新細明體"/>
+                <w:color w:val="D4D4D4"/>
+                <w:kern w:val="0"/>
+                <w:sz w:val="21"/>
+                <w:szCs w:val="21"/>
+              </w:rPr>
+            </w:pPr>
+            <w:r>
+              <w:rPr>
+                <w:rFonts w:ascii="Consolas" w:eastAsia="新細明體" w:hAnsi="Consolas" w:cs="新細明體"/>
+                <w:color w:val="D4D4D4"/>
+                <w:kern w:val="0"/>
+                <w:sz w:val="21"/>
+                <w:szCs w:val="21"/>
+              </w:rPr>
+              <w:t xml:space="preserve">    </w:t>
+            </w:r>
+            <w:r>
+              <w:rPr>
+                <w:rFonts w:ascii="Consolas" w:eastAsia="新細明體" w:hAnsi="Consolas" w:cs="新細明體"/>
+                <w:color w:val="569CD6"/>
+                <w:kern w:val="0"/>
+                <w:sz w:val="21"/>
+                <w:szCs w:val="21"/>
+              </w:rPr>
+              <w:t>int</w:t>
+            </w:r>
+            <w:r>
+              <w:rPr>
+                <w:rFonts w:ascii="Consolas" w:eastAsia="新細明體" w:hAnsi="Consolas" w:cs="新細明體"/>
+                <w:color w:val="D4D4D4"/>
+                <w:kern w:val="0"/>
+                <w:sz w:val="21"/>
+                <w:szCs w:val="21"/>
+              </w:rPr>
+              <w:t xml:space="preserve"> size = </w:t>
+            </w:r>
+            <w:r>
+              <w:rPr>
+                <w:rFonts w:ascii="Consolas" w:eastAsia="新細明體" w:hAnsi="Consolas" w:cs="新細明體"/>
+                <w:color w:val="B5CEA8"/>
+                <w:kern w:val="0"/>
+                <w:sz w:val="21"/>
+                <w:szCs w:val="21"/>
+              </w:rPr>
+              <w:t>2</w:t>
+            </w:r>
+            <w:r>
+              <w:rPr>
+                <w:rFonts w:ascii="Consolas" w:eastAsia="新細明體" w:hAnsi="Consolas" w:cs="新細明體"/>
+                <w:color w:val="D4D4D4"/>
+                <w:kern w:val="0"/>
+                <w:sz w:val="21"/>
+                <w:szCs w:val="21"/>
+              </w:rPr>
+              <w:t xml:space="preserve"> * kernel + </w:t>
+            </w:r>
+            <w:r>
+              <w:rPr>
+                <w:rFonts w:ascii="Consolas" w:eastAsia="新細明體" w:hAnsi="Consolas" w:cs="新細明體"/>
+                <w:color w:val="B5CEA8"/>
+                <w:kern w:val="0"/>
+                <w:sz w:val="21"/>
+                <w:szCs w:val="21"/>
+              </w:rPr>
+              <w:t>1</w:t>
+            </w:r>
+            <w:r>
+              <w:rPr>
+                <w:rFonts w:ascii="Consolas" w:eastAsia="新細明體" w:hAnsi="Consolas" w:cs="新細明體"/>
+                <w:color w:val="D4D4D4"/>
+                <w:kern w:val="0"/>
+                <w:sz w:val="21"/>
+                <w:szCs w:val="21"/>
+              </w:rPr>
+              <w:t>;</w:t>
+            </w:r>
+          </w:p>
+          <w:p>
+            <w:pPr>
+              <w:widowControl/>
+              <w:shd w:val="clear" w:color="auto" w:fill="1E1E1E"/>
+              <w:spacing w:line="285" w:lineRule="atLeast"/>
+              <w:rPr>
+                <w:rFonts w:ascii="Consolas" w:eastAsia="新細明體" w:hAnsi="Consolas" w:cs="新細明體"/>
+                <w:color w:val="D4D4D4"/>
+                <w:kern w:val="0"/>
+                <w:sz w:val="21"/>
+                <w:szCs w:val="21"/>
+              </w:rPr>
+            </w:pPr>
+            <w:r>
+              <w:rPr>
+                <w:rFonts w:ascii="Consolas" w:eastAsia="新細明體" w:hAnsi="Consolas" w:cs="新細明體"/>
+                <w:color w:val="D4D4D4"/>
+                <w:kern w:val="0"/>
+                <w:sz w:val="21"/>
+                <w:szCs w:val="21"/>
+              </w:rPr>
+              <w:t xml:space="preserve">    </w:t>
+            </w:r>
+            <w:r>
+              <w:rPr>
+                <w:rFonts w:ascii="Consolas" w:eastAsia="新細明體" w:hAnsi="Consolas" w:cs="新細明體"/>
+                <w:color w:val="569CD6"/>
+                <w:kern w:val="0"/>
+                <w:sz w:val="21"/>
+                <w:szCs w:val="21"/>
+              </w:rPr>
+              <w:t>double</w:t>
+            </w:r>
+            <w:r>
+              <w:rPr>
+                <w:rFonts w:ascii="Consolas" w:eastAsia="新細明體" w:hAnsi="Consolas" w:cs="新細明體"/>
+                <w:color w:val="D4D4D4"/>
+                <w:kern w:val="0"/>
+                <w:sz w:val="21"/>
+                <w:szCs w:val="21"/>
+              </w:rPr>
+              <w:t xml:space="preserve"> </w:t>
+            </w:r>
+            <w:proofErr w:type="spellStart"/>
+            <w:r>
+              <w:rPr>
+                <w:rFonts w:ascii="Consolas" w:eastAsia="新細明體" w:hAnsi="Consolas" w:cs="新細明體"/>
+                <w:color w:val="9CDCFE"/>
+                <w:kern w:val="0"/>
+                <w:sz w:val="21"/>
+                <w:szCs w:val="21"/>
+              </w:rPr>
+              <w:t>LKernel</w:t>
+            </w:r>
+            <w:proofErr w:type="spellEnd"/>
+            <w:r>
+              <w:rPr>
+                <w:rFonts w:ascii="Consolas" w:eastAsia="新細明體" w:hAnsi="Consolas" w:cs="新細明體"/>
+                <w:color w:val="D4D4D4"/>
+                <w:kern w:val="0"/>
+                <w:sz w:val="21"/>
+                <w:szCs w:val="21"/>
+              </w:rPr>
+              <w:t>[size][size];</w:t>
+            </w:r>
+          </w:p>
+          <w:p>
+            <w:pPr>
+              <w:widowControl/>
+              <w:shd w:val="clear" w:color="auto" w:fill="1E1E1E"/>
+              <w:spacing w:line="285" w:lineRule="atLeast"/>
+              <w:rPr>
+                <w:rFonts w:ascii="Consolas" w:eastAsia="新細明體" w:hAnsi="Consolas" w:cs="新細明體"/>
+                <w:color w:val="D4D4D4"/>
+                <w:kern w:val="0"/>
+                <w:sz w:val="21"/>
+                <w:szCs w:val="21"/>
+              </w:rPr>
+            </w:pPr>
+            <w:r>
+              <w:rPr>
+                <w:rFonts w:ascii="Consolas" w:eastAsia="新細明體" w:hAnsi="Consolas" w:cs="新細明體"/>
+                <w:color w:val="D4D4D4"/>
+                <w:kern w:val="0"/>
+                <w:sz w:val="21"/>
+                <w:szCs w:val="21"/>
+              </w:rPr>
+              <w:t xml:space="preserve">    </w:t>
+            </w:r>
+          </w:p>
+          <w:p>
+            <w:pPr>
+              <w:widowControl/>
+              <w:shd w:val="clear" w:color="auto" w:fill="1E1E1E"/>
+              <w:spacing w:line="285" w:lineRule="atLeast"/>
+              <w:rPr>
+                <w:rFonts w:ascii="Consolas" w:eastAsia="新細明體" w:hAnsi="Consolas" w:cs="新細明體"/>
+                <w:color w:val="D4D4D4"/>
+                <w:kern w:val="0"/>
+                <w:sz w:val="21"/>
+                <w:szCs w:val="21"/>
+              </w:rPr>
+            </w:pPr>
+            <w:r>
+              <w:rPr>
+                <w:rFonts w:ascii="Consolas" w:eastAsia="新細明體" w:hAnsi="Consolas" w:cs="新細明體"/>
+                <w:color w:val="6A9955"/>
+                <w:kern w:val="0"/>
+                <w:sz w:val="21"/>
+                <w:szCs w:val="21"/>
+              </w:rPr>
+              <w:t xml:space="preserve">    // Generate </w:t>
+            </w:r>
+            <w:proofErr w:type="spellStart"/>
+            <w:r>
+              <w:rPr>
+                <w:rFonts w:ascii="Consolas" w:eastAsia="新細明體" w:hAnsi="Consolas" w:cs="新細明體"/>
+                <w:color w:val="6A9955"/>
+                <w:kern w:val="0"/>
+                <w:sz w:val="21"/>
+                <w:szCs w:val="21"/>
+              </w:rPr>
+              <w:t>sobel</w:t>
+            </w:r>
+            <w:proofErr w:type="spellEnd"/>
+            <w:r>
+              <w:rPr>
+                <w:rFonts w:ascii="Consolas" w:eastAsia="新細明體" w:hAnsi="Consolas" w:cs="新細明體"/>
+                <w:color w:val="6A9955"/>
+                <w:kern w:val="0"/>
+                <w:sz w:val="21"/>
+                <w:szCs w:val="21"/>
+              </w:rPr>
+              <w:t xml:space="preserve"> kernel</w:t>
+            </w:r>
+          </w:p>
+          <w:p>
+            <w:pPr>
+              <w:widowControl/>
+              <w:shd w:val="clear" w:color="auto" w:fill="1E1E1E"/>
+              <w:spacing w:line="285" w:lineRule="atLeast"/>
+              <w:rPr>
+                <w:rFonts w:ascii="Consolas" w:eastAsia="新細明體" w:hAnsi="Consolas" w:cs="新細明體"/>
+                <w:color w:val="D4D4D4"/>
+                <w:kern w:val="0"/>
+                <w:sz w:val="21"/>
+                <w:szCs w:val="21"/>
+              </w:rPr>
+            </w:pPr>
+            <w:r>
+              <w:rPr>
+                <w:rFonts w:ascii="Consolas" w:eastAsia="新細明體" w:hAnsi="Consolas" w:cs="新細明體"/>
+                <w:color w:val="D4D4D4"/>
+                <w:kern w:val="0"/>
+                <w:sz w:val="21"/>
+                <w:szCs w:val="21"/>
+              </w:rPr>
+              <w:t xml:space="preserve">    </w:t>
+            </w:r>
+            <w:r>
+              <w:rPr>
+                <w:rFonts w:ascii="Consolas" w:eastAsia="新細明體" w:hAnsi="Consolas" w:cs="新細明體"/>
+                <w:color w:val="C586C0"/>
+                <w:kern w:val="0"/>
+                <w:sz w:val="21"/>
+                <w:szCs w:val="21"/>
+              </w:rPr>
+              <w:t>for</w:t>
+            </w:r>
+            <w:r>
+              <w:rPr>
+                <w:rFonts w:ascii="Consolas" w:eastAsia="新細明體" w:hAnsi="Consolas" w:cs="新細明體"/>
+                <w:color w:val="D4D4D4"/>
+                <w:kern w:val="0"/>
+                <w:sz w:val="21"/>
+                <w:szCs w:val="21"/>
+              </w:rPr>
+              <w:t xml:space="preserve"> (</w:t>
+            </w:r>
+            <w:r>
+              <w:rPr>
+                <w:rFonts w:ascii="Consolas" w:eastAsia="新細明體" w:hAnsi="Consolas" w:cs="新細明體"/>
+                <w:color w:val="569CD6"/>
+                <w:kern w:val="0"/>
+                <w:sz w:val="21"/>
+                <w:szCs w:val="21"/>
+              </w:rPr>
+              <w:t>int</w:t>
+            </w:r>
+            <w:r>
+              <w:rPr>
+                <w:rFonts w:ascii="Consolas" w:eastAsia="新細明體" w:hAnsi="Consolas" w:cs="新細明體"/>
+                <w:color w:val="D4D4D4"/>
+                <w:kern w:val="0"/>
+                <w:sz w:val="21"/>
+                <w:szCs w:val="21"/>
+              </w:rPr>
+              <w:t xml:space="preserve"> y = </w:t>
+            </w:r>
+            <w:r>
+              <w:rPr>
+                <w:rFonts w:ascii="Consolas" w:eastAsia="新細明體" w:hAnsi="Consolas" w:cs="新細明體"/>
+                <w:color w:val="B5CEA8"/>
+                <w:kern w:val="0"/>
+                <w:sz w:val="21"/>
+                <w:szCs w:val="21"/>
+              </w:rPr>
+              <w:t>0</w:t>
+            </w:r>
+            <w:r>
+              <w:rPr>
+                <w:rFonts w:ascii="Consolas" w:eastAsia="新細明體" w:hAnsi="Consolas" w:cs="新細明體"/>
+                <w:color w:val="D4D4D4"/>
+                <w:kern w:val="0"/>
+                <w:sz w:val="21"/>
+                <w:szCs w:val="21"/>
+              </w:rPr>
+              <w:t>; y &lt; size; y++)</w:t>
+            </w:r>
+          </w:p>
+          <w:p>
+            <w:pPr>
+              <w:widowControl/>
+              <w:shd w:val="clear" w:color="auto" w:fill="1E1E1E"/>
+              <w:spacing w:line="285" w:lineRule="atLeast"/>
+              <w:rPr>
+                <w:rFonts w:ascii="Consolas" w:eastAsia="新細明體" w:hAnsi="Consolas" w:cs="新細明體"/>
+                <w:color w:val="D4D4D4"/>
+                <w:kern w:val="0"/>
+                <w:sz w:val="21"/>
+                <w:szCs w:val="21"/>
+              </w:rPr>
+            </w:pPr>
+            <w:r>
+              <w:rPr>
+                <w:rFonts w:ascii="Consolas" w:eastAsia="新細明體" w:hAnsi="Consolas" w:cs="新細明體"/>
+                <w:color w:val="D4D4D4"/>
+                <w:kern w:val="0"/>
+                <w:sz w:val="21"/>
+                <w:szCs w:val="21"/>
+              </w:rPr>
+              <w:t>    {</w:t>
+            </w:r>
+          </w:p>
+          <w:p>
+            <w:pPr>
+              <w:widowControl/>
+              <w:shd w:val="clear" w:color="auto" w:fill="1E1E1E"/>
+              <w:spacing w:line="285" w:lineRule="atLeast"/>
+              <w:rPr>
+                <w:rFonts w:ascii="Consolas" w:eastAsia="新細明體" w:hAnsi="Consolas" w:cs="新細明體"/>
+                <w:color w:val="D4D4D4"/>
+                <w:kern w:val="0"/>
+                <w:sz w:val="21"/>
+                <w:szCs w:val="21"/>
+              </w:rPr>
+            </w:pPr>
+            <w:r>
+              <w:rPr>
+                <w:rFonts w:ascii="Consolas" w:eastAsia="新細明體" w:hAnsi="Consolas" w:cs="新細明體"/>
+                <w:color w:val="D4D4D4"/>
+                <w:kern w:val="0"/>
+                <w:sz w:val="21"/>
+                <w:szCs w:val="21"/>
+              </w:rPr>
               <w:lastRenderedPageBreak/>
-              <w:t>{</w:t>
-            </w:r>
-          </w:p>
-          <w:p>
-            <w:pPr>
-              <w:widowControl/>
-              <w:shd w:val="clear" w:color="auto" w:fill="1E1E1E"/>
-              <w:spacing w:line="285" w:lineRule="atLeast"/>
-              <w:rPr>
-                <w:rFonts w:ascii="Consolas" w:eastAsia="新細明體" w:hAnsi="Consolas" w:cs="新細明體"/>
-                <w:color w:val="D4D4D4"/>
-                <w:kern w:val="0"/>
-                <w:sz w:val="21"/>
-                <w:szCs w:val="21"/>
-              </w:rPr>
-            </w:pPr>
-            <w:r>
-              <w:rPr>
-                <w:rFonts w:ascii="Consolas" w:eastAsia="新細明體" w:hAnsi="Consolas" w:cs="新細明體"/>
-                <w:color w:val="6A9955"/>
-                <w:kern w:val="0"/>
-                <w:sz w:val="21"/>
-                <w:szCs w:val="21"/>
-              </w:rPr>
-              <w:t xml:space="preserve">    // </w:t>
-            </w:r>
-            <w:proofErr w:type="spellStart"/>
-            <w:r>
-              <w:rPr>
-                <w:rFonts w:ascii="Consolas" w:eastAsia="新細明體" w:hAnsi="Consolas" w:cs="新細明體"/>
-                <w:color w:val="6A9955"/>
-                <w:kern w:val="0"/>
-                <w:sz w:val="21"/>
-                <w:szCs w:val="21"/>
-              </w:rPr>
-              <w:t>Initialise</w:t>
-            </w:r>
-            <w:proofErr w:type="spellEnd"/>
-            <w:r>
-              <w:rPr>
-                <w:rFonts w:ascii="Consolas" w:eastAsia="新細明體" w:hAnsi="Consolas" w:cs="新細明體"/>
-                <w:color w:val="6A9955"/>
-                <w:kern w:val="0"/>
-                <w:sz w:val="21"/>
-                <w:szCs w:val="21"/>
-              </w:rPr>
-              <w:t xml:space="preserve"> values</w:t>
-            </w:r>
-          </w:p>
-          <w:p>
-            <w:pPr>
-              <w:widowControl/>
-              <w:shd w:val="clear" w:color="auto" w:fill="1E1E1E"/>
-              <w:spacing w:line="285" w:lineRule="atLeast"/>
-              <w:rPr>
-                <w:rFonts w:ascii="Consolas" w:eastAsia="新細明體" w:hAnsi="Consolas" w:cs="新細明體"/>
-                <w:color w:val="D4D4D4"/>
-                <w:kern w:val="0"/>
-                <w:sz w:val="21"/>
-                <w:szCs w:val="21"/>
-              </w:rPr>
-            </w:pPr>
-            <w:r>
-              <w:rPr>
-                <w:rFonts w:ascii="Consolas" w:eastAsia="新細明體" w:hAnsi="Consolas" w:cs="新細明體"/>
-                <w:color w:val="D4D4D4"/>
-                <w:kern w:val="0"/>
-                <w:sz w:val="21"/>
-                <w:szCs w:val="21"/>
-              </w:rPr>
-              <w:t xml:space="preserve">    </w:t>
-            </w:r>
-            <w:r>
-              <w:rPr>
-                <w:rFonts w:ascii="Consolas" w:eastAsia="新細明體" w:hAnsi="Consolas" w:cs="新細明體"/>
-                <w:color w:val="569CD6"/>
-                <w:kern w:val="0"/>
-                <w:sz w:val="21"/>
-                <w:szCs w:val="21"/>
-              </w:rPr>
-              <w:t>int</w:t>
-            </w:r>
-            <w:r>
-              <w:rPr>
-                <w:rFonts w:ascii="Consolas" w:eastAsia="新細明體" w:hAnsi="Consolas" w:cs="新細明體"/>
-                <w:color w:val="D4D4D4"/>
-                <w:kern w:val="0"/>
-                <w:sz w:val="21"/>
-                <w:szCs w:val="21"/>
-              </w:rPr>
-              <w:t xml:space="preserve"> size = </w:t>
-            </w:r>
-            <w:r>
-              <w:rPr>
-                <w:rFonts w:ascii="Consolas" w:eastAsia="新細明體" w:hAnsi="Consolas" w:cs="新細明體"/>
-                <w:color w:val="B5CEA8"/>
-                <w:kern w:val="0"/>
-                <w:sz w:val="21"/>
-                <w:szCs w:val="21"/>
-              </w:rPr>
-              <w:t>2</w:t>
-            </w:r>
-            <w:r>
-              <w:rPr>
-                <w:rFonts w:ascii="Consolas" w:eastAsia="新細明體" w:hAnsi="Consolas" w:cs="新細明體"/>
-                <w:color w:val="D4D4D4"/>
-                <w:kern w:val="0"/>
-                <w:sz w:val="21"/>
-                <w:szCs w:val="21"/>
-              </w:rPr>
-              <w:t xml:space="preserve"> * kernel + </w:t>
-            </w:r>
-            <w:r>
-              <w:rPr>
-                <w:rFonts w:ascii="Consolas" w:eastAsia="新細明體" w:hAnsi="Consolas" w:cs="新細明體"/>
-                <w:color w:val="B5CEA8"/>
-                <w:kern w:val="0"/>
-                <w:sz w:val="21"/>
-                <w:szCs w:val="21"/>
-              </w:rPr>
-              <w:t>1</w:t>
-            </w:r>
-            <w:r>
-              <w:rPr>
-                <w:rFonts w:ascii="Consolas" w:eastAsia="新細明體" w:hAnsi="Consolas" w:cs="新細明體"/>
-                <w:color w:val="D4D4D4"/>
-                <w:kern w:val="0"/>
-                <w:sz w:val="21"/>
-                <w:szCs w:val="21"/>
-              </w:rPr>
-              <w:t>;</w:t>
-            </w:r>
-          </w:p>
-          <w:p>
-            <w:pPr>
-              <w:widowControl/>
-              <w:shd w:val="clear" w:color="auto" w:fill="1E1E1E"/>
-              <w:spacing w:line="285" w:lineRule="atLeast"/>
-              <w:rPr>
-                <w:rFonts w:ascii="Consolas" w:eastAsia="新細明體" w:hAnsi="Consolas" w:cs="新細明體"/>
-                <w:color w:val="D4D4D4"/>
-                <w:kern w:val="0"/>
-                <w:sz w:val="21"/>
-                <w:szCs w:val="21"/>
-              </w:rPr>
-            </w:pPr>
-            <w:r>
-              <w:rPr>
-                <w:rFonts w:ascii="Consolas" w:eastAsia="新細明體" w:hAnsi="Consolas" w:cs="新細明體"/>
-                <w:color w:val="D4D4D4"/>
-                <w:kern w:val="0"/>
-                <w:sz w:val="21"/>
-                <w:szCs w:val="21"/>
-              </w:rPr>
-              <w:t xml:space="preserve">    </w:t>
-            </w:r>
-            <w:r>
-              <w:rPr>
-                <w:rFonts w:ascii="Consolas" w:eastAsia="新細明體" w:hAnsi="Consolas" w:cs="新細明體"/>
-                <w:color w:val="569CD6"/>
-                <w:kern w:val="0"/>
-                <w:sz w:val="21"/>
-                <w:szCs w:val="21"/>
-              </w:rPr>
-              <w:t>double</w:t>
-            </w:r>
-            <w:r>
-              <w:rPr>
-                <w:rFonts w:ascii="Consolas" w:eastAsia="新細明體" w:hAnsi="Consolas" w:cs="新細明體"/>
-                <w:color w:val="D4D4D4"/>
-                <w:kern w:val="0"/>
-                <w:sz w:val="21"/>
-                <w:szCs w:val="21"/>
-              </w:rPr>
-              <w:t xml:space="preserve"> </w:t>
-            </w:r>
-            <w:proofErr w:type="spellStart"/>
-            <w:r>
-              <w:rPr>
-                <w:rFonts w:ascii="Consolas" w:eastAsia="新細明體" w:hAnsi="Consolas" w:cs="新細明體"/>
-                <w:color w:val="9CDCFE"/>
-                <w:kern w:val="0"/>
-                <w:sz w:val="21"/>
-                <w:szCs w:val="21"/>
-              </w:rPr>
-              <w:t>LKernel</w:t>
-            </w:r>
-            <w:proofErr w:type="spellEnd"/>
-            <w:r>
-              <w:rPr>
-                <w:rFonts w:ascii="Consolas" w:eastAsia="新細明體" w:hAnsi="Consolas" w:cs="新細明體"/>
-                <w:color w:val="D4D4D4"/>
-                <w:kern w:val="0"/>
-                <w:sz w:val="21"/>
-                <w:szCs w:val="21"/>
-              </w:rPr>
-              <w:t>[size][size];</w:t>
-            </w:r>
-          </w:p>
-          <w:p>
-            <w:pPr>
-              <w:widowControl/>
-              <w:shd w:val="clear" w:color="auto" w:fill="1E1E1E"/>
-              <w:spacing w:line="285" w:lineRule="atLeast"/>
-              <w:rPr>
-                <w:rFonts w:ascii="Consolas" w:eastAsia="新細明體" w:hAnsi="Consolas" w:cs="新細明體"/>
-                <w:color w:val="D4D4D4"/>
-                <w:kern w:val="0"/>
-                <w:sz w:val="21"/>
-                <w:szCs w:val="21"/>
-              </w:rPr>
-            </w:pPr>
-            <w:r>
-              <w:rPr>
-                <w:rFonts w:ascii="Consolas" w:eastAsia="新細明體" w:hAnsi="Consolas" w:cs="新細明體"/>
-                <w:color w:val="D4D4D4"/>
-                <w:kern w:val="0"/>
-                <w:sz w:val="21"/>
-                <w:szCs w:val="21"/>
-              </w:rPr>
-              <w:t xml:space="preserve">    </w:t>
-            </w:r>
-          </w:p>
-          <w:p>
-            <w:pPr>
-              <w:widowControl/>
-              <w:shd w:val="clear" w:color="auto" w:fill="1E1E1E"/>
-              <w:spacing w:line="285" w:lineRule="atLeast"/>
-              <w:rPr>
-                <w:rFonts w:ascii="Consolas" w:eastAsia="新細明體" w:hAnsi="Consolas" w:cs="新細明體"/>
-                <w:color w:val="D4D4D4"/>
-                <w:kern w:val="0"/>
-                <w:sz w:val="21"/>
-                <w:szCs w:val="21"/>
-              </w:rPr>
-            </w:pPr>
-            <w:r>
-              <w:rPr>
-                <w:rFonts w:ascii="Consolas" w:eastAsia="新細明體" w:hAnsi="Consolas" w:cs="新細明體"/>
-                <w:color w:val="6A9955"/>
-                <w:kern w:val="0"/>
-                <w:sz w:val="21"/>
-                <w:szCs w:val="21"/>
-              </w:rPr>
-              <w:t xml:space="preserve">    // Generate </w:t>
-            </w:r>
-            <w:proofErr w:type="spellStart"/>
-            <w:r>
-              <w:rPr>
-                <w:rFonts w:ascii="Consolas" w:eastAsia="新細明體" w:hAnsi="Consolas" w:cs="新細明體"/>
-                <w:color w:val="6A9955"/>
-                <w:kern w:val="0"/>
-                <w:sz w:val="21"/>
-                <w:szCs w:val="21"/>
-              </w:rPr>
-              <w:t>sobel</w:t>
-            </w:r>
-            <w:proofErr w:type="spellEnd"/>
-            <w:r>
-              <w:rPr>
-                <w:rFonts w:ascii="Consolas" w:eastAsia="新細明體" w:hAnsi="Consolas" w:cs="新細明體"/>
-                <w:color w:val="6A9955"/>
-                <w:kern w:val="0"/>
-                <w:sz w:val="21"/>
-                <w:szCs w:val="21"/>
-              </w:rPr>
-              <w:t xml:space="preserve"> kernel</w:t>
-            </w:r>
-          </w:p>
-          <w:p>
-            <w:pPr>
-              <w:widowControl/>
-              <w:shd w:val="clear" w:color="auto" w:fill="1E1E1E"/>
-              <w:spacing w:line="285" w:lineRule="atLeast"/>
-              <w:rPr>
-                <w:rFonts w:ascii="Consolas" w:eastAsia="新細明體" w:hAnsi="Consolas" w:cs="新細明體"/>
-                <w:color w:val="D4D4D4"/>
-                <w:kern w:val="0"/>
-                <w:sz w:val="21"/>
-                <w:szCs w:val="21"/>
-              </w:rPr>
-            </w:pPr>
-            <w:r>
-              <w:rPr>
-                <w:rFonts w:ascii="Consolas" w:eastAsia="新細明體" w:hAnsi="Consolas" w:cs="新細明體"/>
-                <w:color w:val="D4D4D4"/>
-                <w:kern w:val="0"/>
-                <w:sz w:val="21"/>
-                <w:szCs w:val="21"/>
-              </w:rPr>
-              <w:t xml:space="preserve">    </w:t>
-            </w:r>
-            <w:r>
-              <w:rPr>
-                <w:rFonts w:ascii="Consolas" w:eastAsia="新細明體" w:hAnsi="Consolas" w:cs="新細明體"/>
-                <w:color w:val="C586C0"/>
-                <w:kern w:val="0"/>
-                <w:sz w:val="21"/>
-                <w:szCs w:val="21"/>
-              </w:rPr>
-              <w:t>for</w:t>
-            </w:r>
-            <w:r>
-              <w:rPr>
-                <w:rFonts w:ascii="Consolas" w:eastAsia="新細明體" w:hAnsi="Consolas" w:cs="新細明體"/>
-                <w:color w:val="D4D4D4"/>
-                <w:kern w:val="0"/>
-                <w:sz w:val="21"/>
-                <w:szCs w:val="21"/>
-              </w:rPr>
-              <w:t xml:space="preserve"> (</w:t>
-            </w:r>
-            <w:r>
-              <w:rPr>
-                <w:rFonts w:ascii="Consolas" w:eastAsia="新細明體" w:hAnsi="Consolas" w:cs="新細明體"/>
-                <w:color w:val="569CD6"/>
-                <w:kern w:val="0"/>
-                <w:sz w:val="21"/>
-                <w:szCs w:val="21"/>
-              </w:rPr>
-              <w:t>int</w:t>
-            </w:r>
-            <w:r>
-              <w:rPr>
-                <w:rFonts w:ascii="Consolas" w:eastAsia="新細明體" w:hAnsi="Consolas" w:cs="新細明體"/>
-                <w:color w:val="D4D4D4"/>
-                <w:kern w:val="0"/>
-                <w:sz w:val="21"/>
-                <w:szCs w:val="21"/>
-              </w:rPr>
-              <w:t xml:space="preserve"> y = </w:t>
-            </w:r>
-            <w:r>
-              <w:rPr>
-                <w:rFonts w:ascii="Consolas" w:eastAsia="新細明體" w:hAnsi="Consolas" w:cs="新細明體"/>
-                <w:color w:val="B5CEA8"/>
-                <w:kern w:val="0"/>
-                <w:sz w:val="21"/>
-                <w:szCs w:val="21"/>
-              </w:rPr>
-              <w:t>0</w:t>
-            </w:r>
-            <w:r>
-              <w:rPr>
-                <w:rFonts w:ascii="Consolas" w:eastAsia="新細明體" w:hAnsi="Consolas" w:cs="新細明體"/>
-                <w:color w:val="D4D4D4"/>
-                <w:kern w:val="0"/>
-                <w:sz w:val="21"/>
-                <w:szCs w:val="21"/>
-              </w:rPr>
-              <w:t>; y &lt; size; y++)</w:t>
-            </w:r>
-          </w:p>
-          <w:p>
-            <w:pPr>
-              <w:widowControl/>
-              <w:shd w:val="clear" w:color="auto" w:fill="1E1E1E"/>
-              <w:spacing w:line="285" w:lineRule="atLeast"/>
-              <w:rPr>
-                <w:rFonts w:ascii="Consolas" w:eastAsia="新細明體" w:hAnsi="Consolas" w:cs="新細明體"/>
-                <w:color w:val="D4D4D4"/>
-                <w:kern w:val="0"/>
-                <w:sz w:val="21"/>
-                <w:szCs w:val="21"/>
-              </w:rPr>
-            </w:pPr>
-            <w:r>
-              <w:rPr>
-                <w:rFonts w:ascii="Consolas" w:eastAsia="新細明體" w:hAnsi="Consolas" w:cs="新細明體"/>
-                <w:color w:val="D4D4D4"/>
-                <w:kern w:val="0"/>
-                <w:sz w:val="21"/>
-                <w:szCs w:val="21"/>
-              </w:rPr>
-              <w:t>    {</w:t>
-            </w:r>
-          </w:p>
-          <w:p>
-            <w:pPr>
-              <w:widowControl/>
-              <w:shd w:val="clear" w:color="auto" w:fill="1E1E1E"/>
-              <w:spacing w:line="285" w:lineRule="atLeast"/>
-              <w:rPr>
-                <w:rFonts w:ascii="Consolas" w:eastAsia="新細明體" w:hAnsi="Consolas" w:cs="新細明體"/>
-                <w:color w:val="D4D4D4"/>
-                <w:kern w:val="0"/>
-                <w:sz w:val="21"/>
-                <w:szCs w:val="21"/>
-              </w:rPr>
-            </w:pPr>
-            <w:r>
-              <w:rPr>
-                <w:rFonts w:ascii="Consolas" w:eastAsia="新細明體" w:hAnsi="Consolas" w:cs="新細明體"/>
-                <w:color w:val="D4D4D4"/>
-                <w:kern w:val="0"/>
-                <w:sz w:val="21"/>
-                <w:szCs w:val="21"/>
-              </w:rPr>
               <w:t xml:space="preserve">        </w:t>
             </w:r>
             <w:r>
@@ -21736,6 +21647,7 @@
                 <w:sz w:val="21"/>
                 <w:szCs w:val="21"/>
               </w:rPr>
+              <w:lastRenderedPageBreak/>
               <w:t xml:space="preserve">    </w:t>
             </w:r>
             <w:r>
@@ -24062,7 +23974,6 @@
                 <w:sz w:val="21"/>
                 <w:szCs w:val="21"/>
               </w:rPr>
-              <w:lastRenderedPageBreak/>
               <w:t xml:space="preserve">    </w:t>
             </w:r>
             <w:proofErr w:type="spellStart"/>
@@ -24519,8 +24430,6 @@
               </w:rPr>
               <w:t>Sobel</w:t>
             </w:r>
-            <w:bookmarkStart w:id="0" w:name="_GoBack"/>
-            <w:bookmarkEnd w:id="0"/>
           </w:p>
         </w:tc>
       </w:tr>
@@ -43972,7 +43881,7 @@
         <w:tblLook w:val="04A0" w:firstRow="1" w:lastRow="0" w:firstColumn="1" w:lastColumn="0" w:noHBand="0" w:noVBand="1"/>
       </w:tblPr>
       <w:tblGrid>
-        <w:gridCol w:w="9016"/>
+        <w:gridCol w:w="9026"/>
       </w:tblGrid>
       <w:tr>
         <w:tc>
@@ -43982,6 +43891,318 @@
               <w:bottom w:val="single" w:sz="18" w:space="0" w:color="7F7F7F" w:themeColor="text1" w:themeTint="80"/>
             </w:tcBorders>
           </w:tcPr>
+          <w:tbl>
+            <w:tblPr>
+              <w:tblStyle w:val="a5"/>
+              <w:tblW w:w="0" w:type="auto"/>
+              <w:tblBorders>
+                <w:top w:val="none" w:sz="0" w:space="0" w:color="auto"/>
+                <w:left w:val="none" w:sz="0" w:space="0" w:color="auto"/>
+                <w:bottom w:val="none" w:sz="0" w:space="0" w:color="auto"/>
+                <w:right w:val="none" w:sz="0" w:space="0" w:color="auto"/>
+                <w:insideH w:val="none" w:sz="0" w:space="0" w:color="auto"/>
+                <w:insideV w:val="none" w:sz="0" w:space="0" w:color="auto"/>
+              </w:tblBorders>
+              <w:tblLook w:val="04A0" w:firstRow="1" w:lastRow="0" w:firstColumn="1" w:lastColumn="0" w:noHBand="0" w:noVBand="1"/>
+            </w:tblPr>
+            <w:tblGrid>
+              <w:gridCol w:w="8810"/>
+            </w:tblGrid>
+            <w:tr>
+              <w:tc>
+                <w:tcPr>
+                  <w:tcW w:w="8800" w:type="dxa"/>
+                  <w:tcBorders>
+                    <w:top w:val="nil"/>
+                    <w:left w:val="nil"/>
+                    <w:bottom w:val="single" w:sz="18" w:space="0" w:color="7F7F7F" w:themeColor="text1" w:themeTint="80"/>
+                    <w:right w:val="nil"/>
+                  </w:tcBorders>
+                  <w:hideMark/>
+                </w:tcPr>
+                <w:p>
+                  <w:pPr>
+                    <w:rPr>
+                      <w:rFonts w:ascii="Times New Roman" w:eastAsia="標楷體" w:hAnsi="Times New Roman" w:cs="Times New Roman"/>
+                      <w:b/>
+                    </w:rPr>
+                  </w:pPr>
+                  <w:r>
+                    <w:rPr>
+                      <w:rFonts w:ascii="Times New Roman" w:eastAsia="標楷體" w:hAnsi="Times New Roman" w:cs="Times New Roman"/>
+                      <w:b/>
+                      <w:sz w:val="32"/>
+                    </w:rPr>
+                    <w:lastRenderedPageBreak/>
+                    <w:t>Reference</w:t>
+                  </w:r>
+                </w:p>
+              </w:tc>
+            </w:tr>
+            <w:tr>
+              <w:tc>
+                <w:tcPr>
+                  <w:tcW w:w="8800" w:type="dxa"/>
+                  <w:hideMark/>
+                </w:tcPr>
+                <w:p>
+                  <w:pPr>
+                    <w:pStyle w:val="a4"/>
+                    <w:numPr>
+                      <w:ilvl w:val="0"/>
+                      <w:numId w:val="5"/>
+                    </w:numPr>
+                    <w:spacing w:afterLines="50" w:after="180"/>
+                    <w:ind w:leftChars="0"/>
+                    <w:rPr>
+                      <w:rFonts w:ascii="Times New Roman" w:eastAsia="標楷體" w:hAnsi="Times New Roman" w:cs="Times New Roman"/>
+                    </w:rPr>
+                  </w:pPr>
+                  <w:hyperlink r:id="rId22" w:history="1">
+                    <w:r>
+                      <w:rPr>
+                        <w:rStyle w:val="a6"/>
+                        <w:rFonts w:ascii="Times New Roman" w:eastAsia="標楷體" w:hAnsi="Times New Roman" w:cs="Times New Roman"/>
+                      </w:rPr>
+                      <w:t>https://blog.csdn.net/qinghuaci666/article/details/81737624?spm=1001.2101.3001.6661.1&amp;utm_medium=distribute.pc_relevant_t0.none-task-blog-2%7Edefault%7ECTRLIST%7Edefault-1-81737624-blog-7297736.pc_relevant_default&amp;depth_1-utm_source=distribute.pc_relevant_t0.none-task-blog-2%7Edefault%7ECTRLIST%7Edefault-1-81737624-blog-7297736.pc_relevant_default&amp;utm_relevant_index=1</w:t>
+                    </w:r>
+                  </w:hyperlink>
+                </w:p>
+                <w:p>
+                  <w:pPr>
+                    <w:pStyle w:val="a4"/>
+                    <w:numPr>
+                      <w:ilvl w:val="0"/>
+                      <w:numId w:val="5"/>
+                    </w:numPr>
+                    <w:spacing w:afterLines="50" w:after="180"/>
+                    <w:ind w:leftChars="0"/>
+                    <w:rPr>
+                      <w:rFonts w:ascii="Times New Roman" w:eastAsia="標楷體" w:hAnsi="Times New Roman" w:cs="Times New Roman"/>
+                    </w:rPr>
+                  </w:pPr>
+                  <w:hyperlink r:id="rId23" w:history="1">
+                    <w:r>
+                      <w:rPr>
+                        <w:rStyle w:val="a6"/>
+                        <w:rFonts w:ascii="Times New Roman" w:eastAsia="標楷體" w:hAnsi="Times New Roman" w:cs="Times New Roman"/>
+                      </w:rPr>
+                      <w:t>http://www.librow.com/articles/article-1</w:t>
+                    </w:r>
+                  </w:hyperlink>
+                </w:p>
+                <w:p>
+                  <w:pPr>
+                    <w:pStyle w:val="a4"/>
+                    <w:numPr>
+                      <w:ilvl w:val="0"/>
+                      <w:numId w:val="5"/>
+                    </w:numPr>
+                    <w:spacing w:afterLines="50" w:after="180"/>
+                    <w:ind w:leftChars="0"/>
+                    <w:rPr>
+                      <w:rFonts w:ascii="Times New Roman" w:eastAsia="標楷體" w:hAnsi="Times New Roman" w:cs="Times New Roman"/>
+                    </w:rPr>
+                  </w:pPr>
+                  <w:hyperlink r:id="rId24" w:history="1">
+                    <w:r>
+                      <w:rPr>
+                        <w:rStyle w:val="a6"/>
+                        <w:rFonts w:ascii="Times New Roman" w:eastAsia="標楷體" w:hAnsi="Times New Roman" w:cs="Times New Roman"/>
+                      </w:rPr>
+                      <w:t>https://www.geeksforgeeks.org/gaussian-filter-generation-c/</w:t>
+                    </w:r>
+                  </w:hyperlink>
+                </w:p>
+                <w:p>
+                  <w:pPr>
+                    <w:pStyle w:val="a4"/>
+                    <w:numPr>
+                      <w:ilvl w:val="0"/>
+                      <w:numId w:val="5"/>
+                    </w:numPr>
+                    <w:spacing w:afterLines="50" w:after="180"/>
+                    <w:ind w:leftChars="0"/>
+                    <w:rPr>
+                      <w:rFonts w:ascii="Times New Roman" w:eastAsia="標楷體" w:hAnsi="Times New Roman" w:cs="Times New Roman"/>
+                    </w:rPr>
+                  </w:pPr>
+                  <w:hyperlink r:id="rId25" w:history="1">
+                    <w:r>
+                      <w:rPr>
+                        <w:rStyle w:val="a6"/>
+                        <w:rFonts w:ascii="Times New Roman" w:eastAsia="標楷體" w:hAnsi="Times New Roman" w:cs="Times New Roman"/>
+                      </w:rPr>
+                      <w:t>https://blog.csdn.net/rocky_shared_image/article/details/7238796</w:t>
+                    </w:r>
+                  </w:hyperlink>
+                </w:p>
+                <w:p>
+                  <w:pPr>
+                    <w:pStyle w:val="a4"/>
+                    <w:numPr>
+                      <w:ilvl w:val="0"/>
+                      <w:numId w:val="5"/>
+                    </w:numPr>
+                    <w:spacing w:afterLines="50" w:after="180"/>
+                    <w:ind w:leftChars="0"/>
+                    <w:rPr>
+                      <w:rFonts w:ascii="Times New Roman" w:eastAsia="標楷體" w:hAnsi="Times New Roman" w:cs="Times New Roman"/>
+                    </w:rPr>
+                  </w:pPr>
+                  <w:hyperlink r:id="rId26" w:history="1">
+                    <w:r>
+                      <w:rPr>
+                        <w:rStyle w:val="a6"/>
+                        <w:rFonts w:ascii="Times New Roman" w:eastAsia="標楷體" w:hAnsi="Times New Roman" w:cs="Times New Roman"/>
+                      </w:rPr>
+                      <w:t>https://medium.com/@bob800530/python-gaussian-filter-%E6%A6%82%E5%BF%B5%E8%88%87%E5%AF%A6%E4%BD%9C-676aac52ea17</w:t>
+                    </w:r>
+                  </w:hyperlink>
+                </w:p>
+                <w:p>
+                  <w:pPr>
+                    <w:pStyle w:val="a4"/>
+                    <w:numPr>
+                      <w:ilvl w:val="0"/>
+                      <w:numId w:val="5"/>
+                    </w:numPr>
+                    <w:spacing w:afterLines="50" w:after="180"/>
+                    <w:ind w:leftChars="0"/>
+                    <w:rPr>
+                      <w:rFonts w:ascii="Times New Roman" w:eastAsia="標楷體" w:hAnsi="Times New Roman" w:cs="Times New Roman"/>
+                    </w:rPr>
+                  </w:pPr>
+                  <w:hyperlink r:id="rId27" w:history="1">
+                    <w:r>
+                      <w:rPr>
+                        <w:rStyle w:val="a6"/>
+                        <w:rFonts w:ascii="Times New Roman" w:eastAsia="標楷體" w:hAnsi="Times New Roman" w:cs="Times New Roman"/>
+                      </w:rPr>
+                      <w:t>https://www.twblogs.net/a/5b7ac2042b7177392c96c153</w:t>
+                    </w:r>
+                  </w:hyperlink>
+                </w:p>
+                <w:p>
+                  <w:pPr>
+                    <w:pStyle w:val="a4"/>
+                    <w:numPr>
+                      <w:ilvl w:val="0"/>
+                      <w:numId w:val="5"/>
+                    </w:numPr>
+                    <w:spacing w:afterLines="50" w:after="180"/>
+                    <w:ind w:leftChars="0"/>
+                    <w:rPr>
+                      <w:rFonts w:ascii="Times New Roman" w:eastAsia="標楷體" w:hAnsi="Times New Roman" w:cs="Times New Roman"/>
+                    </w:rPr>
+                  </w:pPr>
+                  <w:hyperlink r:id="rId28" w:history="1">
+                    <w:r>
+                      <w:rPr>
+                        <w:rStyle w:val="a6"/>
+                        <w:rFonts w:ascii="Times New Roman" w:eastAsia="標楷體" w:hAnsi="Times New Roman" w:cs="Times New Roman"/>
+                      </w:rPr>
+                      <w:t>https://stackoverflow.com/questions/9567882/sobel-filter-kernel-of-large-size</w:t>
+                    </w:r>
+                  </w:hyperlink>
+                </w:p>
+                <w:p>
+                  <w:pPr>
+                    <w:pStyle w:val="a4"/>
+                    <w:numPr>
+                      <w:ilvl w:val="0"/>
+                      <w:numId w:val="5"/>
+                    </w:numPr>
+                    <w:spacing w:afterLines="50" w:after="180"/>
+                    <w:ind w:leftChars="0"/>
+                    <w:rPr>
+                      <w:rFonts w:ascii="Times New Roman" w:eastAsia="標楷體" w:hAnsi="Times New Roman" w:cs="Times New Roman"/>
+                    </w:rPr>
+                  </w:pPr>
+                  <w:hyperlink r:id="rId29" w:history="1">
+                    <w:r>
+                      <w:rPr>
+                        <w:rStyle w:val="a6"/>
+                        <w:rFonts w:ascii="Times New Roman" w:eastAsia="標楷體" w:hAnsi="Times New Roman" w:cs="Times New Roman"/>
+                      </w:rPr>
+                      <w:t>https://docs.opencv.org/3.4/d2/d2c/tutorial_sobel_derivatives.html</w:t>
+                    </w:r>
+                  </w:hyperlink>
+                </w:p>
+                <w:p>
+                  <w:pPr>
+                    <w:pStyle w:val="a4"/>
+                    <w:numPr>
+                      <w:ilvl w:val="0"/>
+                      <w:numId w:val="5"/>
+                    </w:numPr>
+                    <w:spacing w:afterLines="50" w:after="180"/>
+                    <w:ind w:leftChars="0"/>
+                    <w:rPr>
+                      <w:rFonts w:ascii="Times New Roman" w:eastAsia="標楷體" w:hAnsi="Times New Roman" w:cs="Times New Roman"/>
+                    </w:rPr>
+                  </w:pPr>
+                  <w:hyperlink r:id="rId30" w:history="1">
+                    <w:r>
+                      <w:rPr>
+                        <w:rStyle w:val="a6"/>
+                        <w:rFonts w:ascii="Times New Roman" w:eastAsia="標楷體" w:hAnsi="Times New Roman" w:cs="Times New Roman"/>
+                      </w:rPr>
+                      <w:t>https://medium.com/%E9%9B%BB%E8%85%A6%E8%A6%96%E8%A6%BA/%E9%82%8A%E7%B7%A3%E5%81%B5%E6%B8%AC-%E6%8B%89%E6%99%AE%E6%8B%89%E6%96%AF%E7%AE%97%E5%AD%90-laplacian-operator-ea877f1945a0</w:t>
+                    </w:r>
+                  </w:hyperlink>
+                </w:p>
+                <w:p>
+                  <w:pPr>
+                    <w:pStyle w:val="a4"/>
+                    <w:numPr>
+                      <w:ilvl w:val="0"/>
+                      <w:numId w:val="5"/>
+                    </w:numPr>
+                    <w:spacing w:afterLines="50" w:after="180"/>
+                    <w:ind w:leftChars="0"/>
+                    <w:rPr>
+                      <w:rFonts w:ascii="Times New Roman" w:eastAsia="標楷體" w:hAnsi="Times New Roman" w:cs="Times New Roman"/>
+                    </w:rPr>
+                  </w:pPr>
+                  <w:hyperlink r:id="rId31" w:history="1">
+                    <w:r>
+                      <w:rPr>
+                        <w:rStyle w:val="a6"/>
+                        <w:rFonts w:ascii="Times New Roman" w:eastAsia="標楷體" w:hAnsi="Times New Roman" w:cs="Times New Roman"/>
+                      </w:rPr>
+                      <w:t>https://docs.opencv.org/3.4/d5/db5/tutorial_laplace_operator.html</w:t>
+                    </w:r>
+                  </w:hyperlink>
+                </w:p>
+                <w:p>
+                  <w:pPr>
+                    <w:pStyle w:val="a4"/>
+                    <w:numPr>
+                      <w:ilvl w:val="0"/>
+                      <w:numId w:val="5"/>
+                    </w:numPr>
+                    <w:spacing w:afterLines="50" w:after="180"/>
+                    <w:ind w:leftChars="0"/>
+                    <w:rPr>
+                      <w:rFonts w:ascii="Times New Roman" w:eastAsia="標楷體" w:hAnsi="Times New Roman" w:cs="Times New Roman" w:hint="eastAsia"/>
+                    </w:rPr>
+                  </w:pPr>
+                  <w:hyperlink r:id="rId32" w:history="1">
+                    <w:r>
+                      <w:rPr>
+                        <w:rStyle w:val="a6"/>
+                        <w:rFonts w:ascii="Times New Roman" w:eastAsia="標楷體" w:hAnsi="Times New Roman" w:cs="Times New Roman"/>
+                      </w:rPr>
+                      <w:t>https://medium.com/@bob800530/opencv-%E5%AF%A6%E4%BD%9C%E9%82%8A%E7%B7%A3%E5%81%B5%E6%B8%AC-canny%E6%BC%94%E7%AE%97%E6%B3%95-d6e0b92c0aa3</w:t>
+                    </w:r>
+                  </w:hyperlink>
+                  <w:bookmarkStart w:id="0" w:name="_GoBack"/>
+                  <w:bookmarkEnd w:id="0"/>
+                </w:p>
+              </w:tc>
+            </w:tr>
+          </w:tbl>
           <w:p>
             <w:pPr>
               <w:rPr>
@@ -43995,7 +44216,6 @@
                 <w:b/>
                 <w:sz w:val="32"/>
               </w:rPr>
-              <w:lastRenderedPageBreak/>
               <w:t>G</w:t>
             </w:r>
             <w:r>
@@ -44026,7 +44246,7 @@
                 <w:rFonts w:ascii="Times New Roman" w:eastAsia="標楷體" w:hAnsi="Times New Roman" w:cs="Times New Roman"/>
               </w:rPr>
             </w:pPr>
-            <w:hyperlink r:id="rId22" w:history="1">
+            <w:hyperlink r:id="rId33" w:history="1">
               <w:r>
                 <w:rPr>
                   <w:rStyle w:val="a6"/>
@@ -44477,6 +44697,36 @@
   </w:num>
   <w:num w:numId="4">
     <w:abstractNumId w:val="0"/>
+  </w:num>
+  <w:num w:numId="5">
+    <w:abstractNumId w:val="2"/>
+    <w:lvlOverride w:ilvl="0">
+      <w:startOverride w:val="1"/>
+    </w:lvlOverride>
+    <w:lvlOverride w:ilvl="1">
+      <w:startOverride w:val="1"/>
+    </w:lvlOverride>
+    <w:lvlOverride w:ilvl="2">
+      <w:startOverride w:val="1"/>
+    </w:lvlOverride>
+    <w:lvlOverride w:ilvl="3">
+      <w:startOverride w:val="1"/>
+    </w:lvlOverride>
+    <w:lvlOverride w:ilvl="4">
+      <w:startOverride w:val="1"/>
+    </w:lvlOverride>
+    <w:lvlOverride w:ilvl="5">
+      <w:startOverride w:val="1"/>
+    </w:lvlOverride>
+    <w:lvlOverride w:ilvl="6">
+      <w:startOverride w:val="1"/>
+    </w:lvlOverride>
+    <w:lvlOverride w:ilvl="7">
+      <w:startOverride w:val="1"/>
+    </w:lvlOverride>
+    <w:lvlOverride w:ilvl="8">
+      <w:startOverride w:val="1"/>
+    </w:lvlOverride>
   </w:num>
 </w:numbering>
 </file>
@@ -45298,7 +45548,7 @@
 </file>
 
 <file path=customXml/itemProps1.xml><?xml version="1.0" encoding="utf-8"?>
-<ds:datastoreItem xmlns:ds="http://schemas.openxmlformats.org/officeDocument/2006/customXml" ds:itemID="{073A9310-A42C-40B1-834A-082B8CC4F64B}">
+<ds:datastoreItem xmlns:ds="http://schemas.openxmlformats.org/officeDocument/2006/customXml" ds:itemID="{77F51FF9-9725-4294-9ECF-BF76F2B5922F}">
   <ds:schemaRefs>
     <ds:schemaRef ds:uri="http://schemas.openxmlformats.org/officeDocument/2006/bibliography"/>
   </ds:schemaRefs>

</xml_diff>